<commit_message>
Update CV with confirmed Pure Trade duties and save career targets
Adds weekly supplier meetings, daily PO/invoice processing, Power BI KPI checks,
COSMO product measurement, Cape Pack palletization and BAT sample stock.

Co-Authored-By: Claude Opus 5.5 <noreply@anthropic.com>
Claude-Session: https://claude.ai/code/session_019CS2P7JK6dT7jhjPhsDmQa
</commit_message>
<xml_diff>
--- a/cv/CV_Yu_Chiao_Lin_Supply_Planner_Sisley_EN.docx
+++ b/cv/CV_Yu_Chiao_Lin_Supply_Planner_Sisley_EN.docx
@@ -238,7 +238,7 @@
           <w:szCs w:val="18"/>
           <w:rtl w:val="0"/>
         </w:rPr>
-        <w:t xml:space="preserve">Demand planning, forecasting, S&amp;OP and inventory management (academic training); stock data analysis and reconciliation; supplier production follow-up and delay risk management; supplier KPIs (OTD, OTIF, lead time); order management; international logistics (ETD/ETA, Incoterms); CAPA and continuous improvement</w:t>
+        <w:t xml:space="preserve">Demand planning, forecasting, S&amp;OP and inventory management (academic training); stock data reconciliation and data quality control; supplier production follow-up and delay risk management; supplier KPIs (OTD, OTIF, lead time); purchase order and invoice processing; palletization planning; international logistics (ETD/ETA, Incoterms); CAPA and continuous improvement</w:t>
       </w:r>
       <w:r>
         <w:rPr>
@@ -269,7 +269,7 @@
           <w:szCs w:val="18"/>
           <w:rtl w:val="0"/>
         </w:rPr>
-        <w:t xml:space="preserve">Rigour and attention to detail; analytical thinking; proactive risk escalation; cross-functional communication; adaptability in multicultural teams</w:t>
+        <w:t xml:space="preserve">Rigour and attention to detail; problem-solving; analytical thinking; proactive risk escalation; cross-functional communication; adaptability in multicultural teams</w:t>
       </w:r>
       <w:r>
         <w:rPr>
@@ -300,7 +300,7 @@
           <w:szCs w:val="18"/>
           <w:rtl w:val="0"/>
         </w:rPr>
-        <w:t xml:space="preserve">Microsoft Dynamics 365 (ERP), Power BI, Advanced Excel, SQL</w:t>
+        <w:t xml:space="preserve">Microsoft Dynamics 365 (ERP), Power BI, Advanced Excel, SQL, Cape Pack (palletization), L'Oréal COSMO</w:t>
       </w:r>
       <w:r>
         <w:rPr>
@@ -437,7 +437,7 @@
           <w:vertAlign w:val="baseline"/>
           <w:rtl w:val="0"/>
         </w:rPr>
-        <w:t xml:space="preserve">Follow up production schedules and milestones with 4 suppliers across 100+ luxury beauty GWP and VIP gift orders (makeup pouches, bags), working with the manufacturing planning and purchasing teams to anticipate supply delays and secure client launch dates.</w:t>
+        <w:t xml:space="preserve">Lead weekly meetings with 4 suppliers to track production schedules and milestones on 100+ luxury beauty GWP and VIP gift orders (makeup pouches, bags), working with the purchasing and manufacturing planning teams to anticipate supply delays and secure client launch dates.</w:t>
       </w:r>
       <w:r>
         <w:rPr>
@@ -485,7 +485,7 @@
           <w:vertAlign w:val="baseline"/>
           <w:rtl w:val="0"/>
         </w:rPr>
-        <w:t xml:space="preserve">Manage new order follow-up and invoicing in Microsoft Dynamics 365 (ERP) and update the team's weekly order-tracking tool, keeping order status reliable and open orders visible.</w:t>
+        <w:t xml:space="preserve">Process 10–15 purchase orders and invoices per day in Microsoft Dynamics 365 (ERP), following up with buyers on missing or incorrect data to keep order status reliable.</w:t>
       </w:r>
       <w:r>
         <w:rPr>
@@ -533,7 +533,7 @@
           <w:vertAlign w:val="baseline"/>
           <w:rtl w:val="0"/>
         </w:rPr>
-        <w:t xml:space="preserve">Report supplier delivery performance (OTD, OTIF) and order KPIs to internal teams, and keep order status up to date in the team's Power BI report.</w:t>
+        <w:t xml:space="preserve">Check KPIs daily in Power BI and clean the source data in Excel, detecting and correcting errors so that supplier delivery (OTD, OTIF) and order reporting stays reliable.</w:t>
       </w:r>
       <w:r>
         <w:rPr>
@@ -629,7 +629,103 @@
           <w:vertAlign w:val="baseline"/>
           <w:rtl w:val="0"/>
         </w:rPr>
+        <w:t xml:space="preserve">Measure finished products with their packaging and record the data in L'Oréal's COSMO system; build palletization plans in Cape Pack that meet each brand's maximum pallet height and weight.</w:t>
+      </w:r>
+      <w:r>
+        <w:rPr>
+          <w:rtl w:val="0"/>
+        </w:rPr>
+      </w:r>
+    </w:p>
+    <w:p>
+      <w:pPr>
+        <w:keepNext w:val="0"/>
+        <w:keepLines w:val="0"/>
+        <w:pageBreakBefore w:val="0"/>
+        <w:widowControl w:val="1"/>
+        <w:numPr>
+          <w:ilvl w:val="0"/>
+          <w:numId w:val="1"/>
+        </w:numPr>
+        <w:pBdr>
+          <w:top w:space="0" w:sz="0" w:val="nil"/>
+          <w:left w:space="0" w:sz="0" w:val="nil"/>
+          <w:bottom w:space="0" w:sz="0" w:val="nil"/>
+          <w:right w:space="0" w:sz="0" w:val="nil"/>
+          <w:between w:space="0" w:sz="0" w:val="nil"/>
+        </w:pBdr>
+        <w:shd w:fill="auto" w:val="clear"/>
+        <w:spacing w:after="15" w:before="0" w:line="240" w:lineRule="auto"/>
+        <w:ind w:left="360" w:right="0" w:hanging="240"/>
+        <w:jc w:val="left"/>
+        <w:rPr/>
+      </w:pPr>
+      <w:r>
+        <w:rPr>
+          <w:rFonts w:ascii="Calibri" w:cs="Calibri" w:eastAsia="Calibri" w:hAnsi="Calibri"/>
+          <w:b w:val="0"/>
+          <w:bCs w:val="0"/>
+          <w:i w:val="0"/>
+          <w:iCs w:val="0"/>
+          <w:smallCaps w:val="0"/>
+          <w:strike w:val="0"/>
+          <w:color w:val="000000"/>
+          <w:sz w:val="18"/>
+          <w:szCs w:val="18"/>
+          <w:u w:val="none"/>
+          <w:shd w:fill="auto" w:val="clear"/>
+          <w:vertAlign w:val="baseline"/>
+          <w:rtl w:val="0"/>
+        </w:rPr>
         <w:t xml:space="preserve">Coordinate international shipments from factory to final delivery (ETD/ETA; sea, air and road freight; FCA Incoterms) with suppliers and freight forwarders, resolving transport delays.</w:t>
+      </w:r>
+      <w:r>
+        <w:rPr>
+          <w:rtl w:val="0"/>
+        </w:rPr>
+      </w:r>
+    </w:p>
+    <w:p>
+      <w:pPr>
+        <w:keepNext w:val="0"/>
+        <w:keepLines w:val="0"/>
+        <w:pageBreakBefore w:val="0"/>
+        <w:widowControl w:val="1"/>
+        <w:numPr>
+          <w:ilvl w:val="0"/>
+          <w:numId w:val="1"/>
+        </w:numPr>
+        <w:pBdr>
+          <w:top w:space="0" w:sz="0" w:val="nil"/>
+          <w:left w:space="0" w:sz="0" w:val="nil"/>
+          <w:bottom w:space="0" w:sz="0" w:val="nil"/>
+          <w:right w:space="0" w:sz="0" w:val="nil"/>
+          <w:between w:space="0" w:sz="0" w:val="nil"/>
+        </w:pBdr>
+        <w:shd w:fill="auto" w:val="clear"/>
+        <w:spacing w:after="15" w:before="0" w:line="240" w:lineRule="auto"/>
+        <w:ind w:left="360" w:right="0" w:hanging="240"/>
+        <w:jc w:val="left"/>
+        <w:rPr/>
+      </w:pPr>
+      <w:r>
+        <w:rPr>
+          <w:rFonts w:ascii="Calibri" w:cs="Calibri" w:eastAsia="Calibri" w:hAnsi="Calibri"/>
+          <w:b w:val="0"/>
+          <w:bCs w:val="0"/>
+          <w:i w:val="0"/>
+          <w:iCs w:val="0"/>
+          <w:smallCaps w:val="0"/>
+          <w:strike w:val="0"/>
+          <w:color w:val="000000"/>
+          <w:sz w:val="18"/>
+          <w:szCs w:val="18"/>
+          <w:u w:val="none"/>
+          <w:shd w:fill="auto" w:val="clear"/>
+          <w:vertAlign w:val="baseline"/>
+          <w:rtl w:val="0"/>
+        </w:rPr>
+        <w:t xml:space="preserve">Monitor the in-office stock of BAT (pre-production approval) samples.</w:t>
       </w:r>
       <w:r>
         <w:rPr>

</xml_diff>